<commit_message>
Add CEA Word draft quality audit
</commit_message>
<xml_diff>
--- a/paper/cea_template_migration/manuscript_cea_template_draft.docx
+++ b/paper/cea_template_migration/manuscript_cea_template_draft.docx
@@ -854,7 +854,7 @@
           <wp:inline distT="0" distB="0" distL="0" distR="0">
             <wp:extent cx="5303520" cy="2724792"/>
             <wp:effectExtent l="0" t="0" r="0" b="0"/>
-            <wp:docPr id="13307" name="hrpca_yolo11n_overview.png"/>
+            <wp:docPr id="32516" name="hrpca_yolo11n_overview.png"/>
             <wp:cNvGraphicFramePr>
               <a:graphicFrameLocks noChangeAspect="1"/>
             </wp:cNvGraphicFramePr>
@@ -862,7 +862,7 @@
               <a:graphicData uri="http://schemas.openxmlformats.org/drawingml/2006/picture">
                 <pic:pic>
                   <pic:nvPicPr>
-                    <pic:cNvPr id="13308" name="hrpca_yolo11n_overview.png"/>
+                    <pic:cNvPr id="32517" name="hrpca_yolo11n_overview.png"/>
                     <pic:cNvPicPr/>
                   </pic:nvPicPr>
                   <pic:blipFill>
@@ -4128,7 +4128,7 @@
           <wp:inline distT="0" distB="0" distL="0" distR="0">
             <wp:extent cx="5303520" cy="2651760"/>
             <wp:effectExtent l="0" t="0" r="0" b="0"/>
-            <wp:docPr id="23340" name="p2_coordatt_960_results.png"/>
+            <wp:docPr id="87459" name="p2_coordatt_960_results.png"/>
             <wp:cNvGraphicFramePr>
               <a:graphicFrameLocks noChangeAspect="1"/>
             </wp:cNvGraphicFramePr>
@@ -4136,7 +4136,7 @@
               <a:graphicData uri="http://schemas.openxmlformats.org/drawingml/2006/picture">
                 <pic:pic>
                   <pic:nvPicPr>
-                    <pic:cNvPr id="23341" name="p2_coordatt_960_results.png"/>
+                    <pic:cNvPr id="87460" name="p2_coordatt_960_results.png"/>
                     <pic:cNvPicPr/>
                   </pic:nvPicPr>
                   <pic:blipFill>
@@ -5285,7 +5285,7 @@
           <wp:inline distT="0" distB="0" distL="0" distR="0">
             <wp:extent cx="5303520" cy="3079463"/>
             <wp:effectExtent l="0" t="0" r="0" b="0"/>
-            <wp:docPr id="44628" name="object_scale_distribution.png"/>
+            <wp:docPr id="67799" name="object_scale_distribution.png"/>
             <wp:cNvGraphicFramePr>
               <a:graphicFrameLocks noChangeAspect="1"/>
             </wp:cNvGraphicFramePr>
@@ -5293,7 +5293,7 @@
               <a:graphicData uri="http://schemas.openxmlformats.org/drawingml/2006/picture">
                 <pic:pic>
                   <pic:nvPicPr>
-                    <pic:cNvPr id="44629" name="object_scale_distribution.png"/>
+                    <pic:cNvPr id="67800" name="object_scale_distribution.png"/>
                     <pic:cNvPicPr/>
                   </pic:nvPicPr>
                   <pic:blipFill>
@@ -6219,7 +6219,7 @@
           <wp:inline distT="0" distB="0" distL="0" distR="0">
             <wp:extent cx="5303520" cy="3148964"/>
             <wp:effectExtent l="0" t="0" r="0" b="0"/>
-            <wp:docPr id="38169" name="scale_group_recall.png"/>
+            <wp:docPr id="37328" name="scale_group_recall.png"/>
             <wp:cNvGraphicFramePr>
               <a:graphicFrameLocks noChangeAspect="1"/>
             </wp:cNvGraphicFramePr>
@@ -6227,7 +6227,7 @@
               <a:graphicData uri="http://schemas.openxmlformats.org/drawingml/2006/picture">
                 <pic:pic>
                   <pic:nvPicPr>
-                    <pic:cNvPr id="38170" name="scale_group_recall.png"/>
+                    <pic:cNvPr id="37329" name="scale_group_recall.png"/>
                     <pic:cNvPicPr/>
                   </pic:nvPicPr>
                   <pic:blipFill>
@@ -9211,7 +9211,7 @@
           <wp:inline distT="0" distB="0" distL="0" distR="0">
             <wp:extent cx="5303520" cy="3082671"/>
             <wp:effectExtent l="0" t="0" r="0" b="0"/>
-            <wp:docPr id="92227" name="p2_coordatt_960_val_batch0_pred.jpg"/>
+            <wp:docPr id="38782" name="p2_coordatt_960_val_batch0_pred.jpg"/>
             <wp:cNvGraphicFramePr>
               <a:graphicFrameLocks noChangeAspect="1"/>
             </wp:cNvGraphicFramePr>
@@ -9219,7 +9219,7 @@
               <a:graphicData uri="http://schemas.openxmlformats.org/drawingml/2006/picture">
                 <pic:pic>
                   <pic:nvPicPr>
-                    <pic:cNvPr id="92228" name="p2_coordatt_960_val_batch0_pred.jpg"/>
+                    <pic:cNvPr id="38783" name="p2_coordatt_960_val_batch0_pred.jpg"/>
                     <pic:cNvPicPr/>
                   </pic:nvPicPr>
                   <pic:blipFill>
@@ -9282,7 +9282,7 @@
           <wp:inline distT="0" distB="0" distL="0" distR="0">
             <wp:extent cx="5303520" cy="12493526"/>
             <wp:effectExtent l="0" t="0" r="0" b="0"/>
-            <wp:docPr id="37164" name="p2_case_contact_sheet.jpg"/>
+            <wp:docPr id="65265" name="p2_case_contact_sheet.jpg"/>
             <wp:cNvGraphicFramePr>
               <a:graphicFrameLocks noChangeAspect="1"/>
             </wp:cNvGraphicFramePr>
@@ -9290,7 +9290,7 @@
               <a:graphicData uri="http://schemas.openxmlformats.org/drawingml/2006/picture">
                 <pic:pic>
                   <pic:nvPicPr>
-                    <pic:cNvPr id="37165" name="p2_case_contact_sheet.jpg"/>
+                    <pic:cNvPr id="65266" name="p2_case_contact_sheet.jpg"/>
                     <pic:cNvPicPr/>
                   </pic:nvPicPr>
                   <pic:blipFill>

</xml_diff>

<commit_message>
Polish CEA Word submission preflight
</commit_message>
<xml_diff>
--- a/paper/cea_template_migration/manuscript_cea_template_draft.docx
+++ b/paper/cea_template_migration/manuscript_cea_template_draft.docx
@@ -169,16 +169,13 @@
     </w:p>
     <w:p>
       <w:pPr>
-        <w:pStyle w:val="Normal"/>
-      </w:pPr>
-      <w:r>
-        <w:rPr>
-          <w:rFonts w:ascii="Times New Roman" w:eastAsia="SimSun" w:hAnsi="Times New Roman"/>
-          <w:sz w:val="18"/>
-          <w:szCs w:val="18"/>
-        </w:rPr>
-        <w:t xml:space="preserve">引言部分按《计算机工程与应用》模板要求不单独编号。</w:t>
-      </w:r>
+        <w:sectPr>
+          <w:pgSz w:w="11906" w:h="16838"/>
+          <w:pgMar w:top="1440" w:right="900" w:bottom="900" w:left="900" w:header="720" w:footer="720" w:gutter="0"/>
+          <w:cols w:space="397"/>
+          <w:docGrid w:type="lines" w:linePitch="290"/>
+        </w:sectPr>
+      </w:pPr>
     </w:p>
     <w:p>
       <w:pPr>
@@ -854,7 +851,7 @@
           <wp:inline distT="0" distB="0" distL="0" distR="0">
             <wp:extent cx="5303520" cy="2724792"/>
             <wp:effectExtent l="0" t="0" r="0" b="0"/>
-            <wp:docPr id="32516" name="hrpca_yolo11n_overview.png"/>
+            <wp:docPr id="27504" name="hrpca_yolo11n_overview.png"/>
             <wp:cNvGraphicFramePr>
               <a:graphicFrameLocks noChangeAspect="1"/>
             </wp:cNvGraphicFramePr>
@@ -862,7 +859,7 @@
               <a:graphicData uri="http://schemas.openxmlformats.org/drawingml/2006/picture">
                 <pic:pic>
                   <pic:nvPicPr>
-                    <pic:cNvPr id="32517" name="hrpca_yolo11n_overview.png"/>
+                    <pic:cNvPr id="27505" name="hrpca_yolo11n_overview.png"/>
                     <pic:cNvPicPr/>
                   </pic:nvPicPr>
                   <pic:blipFill>
@@ -4128,7 +4125,7 @@
           <wp:inline distT="0" distB="0" distL="0" distR="0">
             <wp:extent cx="5303520" cy="2651760"/>
             <wp:effectExtent l="0" t="0" r="0" b="0"/>
-            <wp:docPr id="87459" name="p2_coordatt_960_results.png"/>
+            <wp:docPr id="85215" name="p2_coordatt_960_results.png"/>
             <wp:cNvGraphicFramePr>
               <a:graphicFrameLocks noChangeAspect="1"/>
             </wp:cNvGraphicFramePr>
@@ -4136,7 +4133,7 @@
               <a:graphicData uri="http://schemas.openxmlformats.org/drawingml/2006/picture">
                 <pic:pic>
                   <pic:nvPicPr>
-                    <pic:cNvPr id="87460" name="p2_coordatt_960_results.png"/>
+                    <pic:cNvPr id="85216" name="p2_coordatt_960_results.png"/>
                     <pic:cNvPicPr/>
                   </pic:nvPicPr>
                   <pic:blipFill>
@@ -5285,7 +5282,7 @@
           <wp:inline distT="0" distB="0" distL="0" distR="0">
             <wp:extent cx="5303520" cy="3079463"/>
             <wp:effectExtent l="0" t="0" r="0" b="0"/>
-            <wp:docPr id="67799" name="object_scale_distribution.png"/>
+            <wp:docPr id="1408" name="object_scale_distribution.png"/>
             <wp:cNvGraphicFramePr>
               <a:graphicFrameLocks noChangeAspect="1"/>
             </wp:cNvGraphicFramePr>
@@ -5293,7 +5290,7 @@
               <a:graphicData uri="http://schemas.openxmlformats.org/drawingml/2006/picture">
                 <pic:pic>
                   <pic:nvPicPr>
-                    <pic:cNvPr id="67800" name="object_scale_distribution.png"/>
+                    <pic:cNvPr id="1409" name="object_scale_distribution.png"/>
                     <pic:cNvPicPr/>
                   </pic:nvPicPr>
                   <pic:blipFill>
@@ -6219,7 +6216,7 @@
           <wp:inline distT="0" distB="0" distL="0" distR="0">
             <wp:extent cx="5303520" cy="3148964"/>
             <wp:effectExtent l="0" t="0" r="0" b="0"/>
-            <wp:docPr id="37328" name="scale_group_recall.png"/>
+            <wp:docPr id="70250" name="scale_group_recall.png"/>
             <wp:cNvGraphicFramePr>
               <a:graphicFrameLocks noChangeAspect="1"/>
             </wp:cNvGraphicFramePr>
@@ -6227,7 +6224,7 @@
               <a:graphicData uri="http://schemas.openxmlformats.org/drawingml/2006/picture">
                 <pic:pic>
                   <pic:nvPicPr>
-                    <pic:cNvPr id="37329" name="scale_group_recall.png"/>
+                    <pic:cNvPr id="70251" name="scale_group_recall.png"/>
                     <pic:cNvPicPr/>
                   </pic:nvPicPr>
                   <pic:blipFill>
@@ -9211,7 +9208,7 @@
           <wp:inline distT="0" distB="0" distL="0" distR="0">
             <wp:extent cx="5303520" cy="3082671"/>
             <wp:effectExtent l="0" t="0" r="0" b="0"/>
-            <wp:docPr id="38782" name="p2_coordatt_960_val_batch0_pred.jpg"/>
+            <wp:docPr id="46376" name="p2_coordatt_960_val_batch0_pred.jpg"/>
             <wp:cNvGraphicFramePr>
               <a:graphicFrameLocks noChangeAspect="1"/>
             </wp:cNvGraphicFramePr>
@@ -9219,7 +9216,7 @@
               <a:graphicData uri="http://schemas.openxmlformats.org/drawingml/2006/picture">
                 <pic:pic>
                   <pic:nvPicPr>
-                    <pic:cNvPr id="38783" name="p2_coordatt_960_val_batch0_pred.jpg"/>
+                    <pic:cNvPr id="46377" name="p2_coordatt_960_val_batch0_pred.jpg"/>
                     <pic:cNvPicPr/>
                   </pic:nvPicPr>
                   <pic:blipFill>
@@ -9282,7 +9279,7 @@
           <wp:inline distT="0" distB="0" distL="0" distR="0">
             <wp:extent cx="5303520" cy="12493526"/>
             <wp:effectExtent l="0" t="0" r="0" b="0"/>
-            <wp:docPr id="65265" name="p2_case_contact_sheet.jpg"/>
+            <wp:docPr id="26567" name="p2_case_contact_sheet.jpg"/>
             <wp:cNvGraphicFramePr>
               <a:graphicFrameLocks noChangeAspect="1"/>
             </wp:cNvGraphicFramePr>
@@ -9290,7 +9287,7 @@
               <a:graphicData uri="http://schemas.openxmlformats.org/drawingml/2006/picture">
                 <pic:pic>
                   <pic:nvPicPr>
-                    <pic:cNvPr id="65266" name="p2_case_contact_sheet.jpg"/>
+                    <pic:cNvPr id="26568" name="p2_case_contact_sheet.jpg"/>
                     <pic:cNvPicPr/>
                   </pic:nvPicPr>
                   <pic:blipFill>

</xml_diff>

<commit_message>
Record CEA official guide verification
</commit_message>
<xml_diff>
--- a/paper/cea_template_migration/manuscript_cea_template_draft.docx
+++ b/paper/cea_template_migration/manuscript_cea_template_draft.docx
@@ -851,7 +851,7 @@
           <wp:inline distT="0" distB="0" distL="0" distR="0">
             <wp:extent cx="5303520" cy="2724792"/>
             <wp:effectExtent l="0" t="0" r="0" b="0"/>
-            <wp:docPr id="27504" name="hrpca_yolo11n_overview.png"/>
+            <wp:docPr id="12587" name="hrpca_yolo11n_overview.png"/>
             <wp:cNvGraphicFramePr>
               <a:graphicFrameLocks noChangeAspect="1"/>
             </wp:cNvGraphicFramePr>
@@ -859,7 +859,7 @@
               <a:graphicData uri="http://schemas.openxmlformats.org/drawingml/2006/picture">
                 <pic:pic>
                   <pic:nvPicPr>
-                    <pic:cNvPr id="27505" name="hrpca_yolo11n_overview.png"/>
+                    <pic:cNvPr id="12588" name="hrpca_yolo11n_overview.png"/>
                     <pic:cNvPicPr/>
                   </pic:nvPicPr>
                   <pic:blipFill>
@@ -4125,7 +4125,7 @@
           <wp:inline distT="0" distB="0" distL="0" distR="0">
             <wp:extent cx="5303520" cy="2651760"/>
             <wp:effectExtent l="0" t="0" r="0" b="0"/>
-            <wp:docPr id="85215" name="p2_coordatt_960_results.png"/>
+            <wp:docPr id="84519" name="p2_coordatt_960_results.png"/>
             <wp:cNvGraphicFramePr>
               <a:graphicFrameLocks noChangeAspect="1"/>
             </wp:cNvGraphicFramePr>
@@ -4133,7 +4133,7 @@
               <a:graphicData uri="http://schemas.openxmlformats.org/drawingml/2006/picture">
                 <pic:pic>
                   <pic:nvPicPr>
-                    <pic:cNvPr id="85216" name="p2_coordatt_960_results.png"/>
+                    <pic:cNvPr id="84520" name="p2_coordatt_960_results.png"/>
                     <pic:cNvPicPr/>
                   </pic:nvPicPr>
                   <pic:blipFill>
@@ -5282,7 +5282,7 @@
           <wp:inline distT="0" distB="0" distL="0" distR="0">
             <wp:extent cx="5303520" cy="3079463"/>
             <wp:effectExtent l="0" t="0" r="0" b="0"/>
-            <wp:docPr id="1408" name="object_scale_distribution.png"/>
+            <wp:docPr id="87981" name="object_scale_distribution.png"/>
             <wp:cNvGraphicFramePr>
               <a:graphicFrameLocks noChangeAspect="1"/>
             </wp:cNvGraphicFramePr>
@@ -5290,7 +5290,7 @@
               <a:graphicData uri="http://schemas.openxmlformats.org/drawingml/2006/picture">
                 <pic:pic>
                   <pic:nvPicPr>
-                    <pic:cNvPr id="1409" name="object_scale_distribution.png"/>
+                    <pic:cNvPr id="87982" name="object_scale_distribution.png"/>
                     <pic:cNvPicPr/>
                   </pic:nvPicPr>
                   <pic:blipFill>
@@ -6216,7 +6216,7 @@
           <wp:inline distT="0" distB="0" distL="0" distR="0">
             <wp:extent cx="5303520" cy="3148964"/>
             <wp:effectExtent l="0" t="0" r="0" b="0"/>
-            <wp:docPr id="70250" name="scale_group_recall.png"/>
+            <wp:docPr id="29374" name="scale_group_recall.png"/>
             <wp:cNvGraphicFramePr>
               <a:graphicFrameLocks noChangeAspect="1"/>
             </wp:cNvGraphicFramePr>
@@ -6224,7 +6224,7 @@
               <a:graphicData uri="http://schemas.openxmlformats.org/drawingml/2006/picture">
                 <pic:pic>
                   <pic:nvPicPr>
-                    <pic:cNvPr id="70251" name="scale_group_recall.png"/>
+                    <pic:cNvPr id="29375" name="scale_group_recall.png"/>
                     <pic:cNvPicPr/>
                   </pic:nvPicPr>
                   <pic:blipFill>
@@ -9208,7 +9208,7 @@
           <wp:inline distT="0" distB="0" distL="0" distR="0">
             <wp:extent cx="5303520" cy="3082671"/>
             <wp:effectExtent l="0" t="0" r="0" b="0"/>
-            <wp:docPr id="46376" name="p2_coordatt_960_val_batch0_pred.jpg"/>
+            <wp:docPr id="49157" name="p2_coordatt_960_val_batch0_pred.jpg"/>
             <wp:cNvGraphicFramePr>
               <a:graphicFrameLocks noChangeAspect="1"/>
             </wp:cNvGraphicFramePr>
@@ -9216,7 +9216,7 @@
               <a:graphicData uri="http://schemas.openxmlformats.org/drawingml/2006/picture">
                 <pic:pic>
                   <pic:nvPicPr>
-                    <pic:cNvPr id="46377" name="p2_coordatt_960_val_batch0_pred.jpg"/>
+                    <pic:cNvPr id="49158" name="p2_coordatt_960_val_batch0_pred.jpg"/>
                     <pic:cNvPicPr/>
                   </pic:nvPicPr>
                   <pic:blipFill>
@@ -9279,7 +9279,7 @@
           <wp:inline distT="0" distB="0" distL="0" distR="0">
             <wp:extent cx="5303520" cy="12493526"/>
             <wp:effectExtent l="0" t="0" r="0" b="0"/>
-            <wp:docPr id="26567" name="p2_case_contact_sheet.jpg"/>
+            <wp:docPr id="69730" name="p2_case_contact_sheet.jpg"/>
             <wp:cNvGraphicFramePr>
               <a:graphicFrameLocks noChangeAspect="1"/>
             </wp:cNvGraphicFramePr>
@@ -9287,7 +9287,7 @@
               <a:graphicData uri="http://schemas.openxmlformats.org/drawingml/2006/picture">
                 <pic:pic>
                   <pic:nvPicPr>
-                    <pic:cNvPr id="26568" name="p2_case_contact_sheet.jpg"/>
+                    <pic:cNvPr id="69731" name="p2_case_contact_sheet.jpg"/>
                     <pic:cNvPicPr/>
                   </pic:nvPicPr>
                   <pic:blipFill>

</xml_diff>

<commit_message>
Mark local CEA preparation objective complete
</commit_message>
<xml_diff>
--- a/paper/cea_template_migration/manuscript_cea_template_draft.docx
+++ b/paper/cea_template_migration/manuscript_cea_template_draft.docx
@@ -851,7 +851,7 @@
           <wp:inline distT="0" distB="0" distL="0" distR="0">
             <wp:extent cx="5303520" cy="2724792"/>
             <wp:effectExtent l="0" t="0" r="0" b="0"/>
-            <wp:docPr id="12587" name="hrpca_yolo11n_overview.png"/>
+            <wp:docPr id="92731" name="hrpca_yolo11n_overview.png"/>
             <wp:cNvGraphicFramePr>
               <a:graphicFrameLocks noChangeAspect="1"/>
             </wp:cNvGraphicFramePr>
@@ -859,7 +859,7 @@
               <a:graphicData uri="http://schemas.openxmlformats.org/drawingml/2006/picture">
                 <pic:pic>
                   <pic:nvPicPr>
-                    <pic:cNvPr id="12588" name="hrpca_yolo11n_overview.png"/>
+                    <pic:cNvPr id="92732" name="hrpca_yolo11n_overview.png"/>
                     <pic:cNvPicPr/>
                   </pic:nvPicPr>
                   <pic:blipFill>
@@ -4125,7 +4125,7 @@
           <wp:inline distT="0" distB="0" distL="0" distR="0">
             <wp:extent cx="5303520" cy="2651760"/>
             <wp:effectExtent l="0" t="0" r="0" b="0"/>
-            <wp:docPr id="84519" name="p2_coordatt_960_results.png"/>
+            <wp:docPr id="100008" name="p2_coordatt_960_results.png"/>
             <wp:cNvGraphicFramePr>
               <a:graphicFrameLocks noChangeAspect="1"/>
             </wp:cNvGraphicFramePr>
@@ -4133,7 +4133,7 @@
               <a:graphicData uri="http://schemas.openxmlformats.org/drawingml/2006/picture">
                 <pic:pic>
                   <pic:nvPicPr>
-                    <pic:cNvPr id="84520" name="p2_coordatt_960_results.png"/>
+                    <pic:cNvPr id="100009" name="p2_coordatt_960_results.png"/>
                     <pic:cNvPicPr/>
                   </pic:nvPicPr>
                   <pic:blipFill>
@@ -5282,7 +5282,7 @@
           <wp:inline distT="0" distB="0" distL="0" distR="0">
             <wp:extent cx="5303520" cy="3079463"/>
             <wp:effectExtent l="0" t="0" r="0" b="0"/>
-            <wp:docPr id="87981" name="object_scale_distribution.png"/>
+            <wp:docPr id="3007" name="object_scale_distribution.png"/>
             <wp:cNvGraphicFramePr>
               <a:graphicFrameLocks noChangeAspect="1"/>
             </wp:cNvGraphicFramePr>
@@ -5290,7 +5290,7 @@
               <a:graphicData uri="http://schemas.openxmlformats.org/drawingml/2006/picture">
                 <pic:pic>
                   <pic:nvPicPr>
-                    <pic:cNvPr id="87982" name="object_scale_distribution.png"/>
+                    <pic:cNvPr id="3008" name="object_scale_distribution.png"/>
                     <pic:cNvPicPr/>
                   </pic:nvPicPr>
                   <pic:blipFill>
@@ -6216,7 +6216,7 @@
           <wp:inline distT="0" distB="0" distL="0" distR="0">
             <wp:extent cx="5303520" cy="3148964"/>
             <wp:effectExtent l="0" t="0" r="0" b="0"/>
-            <wp:docPr id="29374" name="scale_group_recall.png"/>
+            <wp:docPr id="93834" name="scale_group_recall.png"/>
             <wp:cNvGraphicFramePr>
               <a:graphicFrameLocks noChangeAspect="1"/>
             </wp:cNvGraphicFramePr>
@@ -6224,7 +6224,7 @@
               <a:graphicData uri="http://schemas.openxmlformats.org/drawingml/2006/picture">
                 <pic:pic>
                   <pic:nvPicPr>
-                    <pic:cNvPr id="29375" name="scale_group_recall.png"/>
+                    <pic:cNvPr id="93835" name="scale_group_recall.png"/>
                     <pic:cNvPicPr/>
                   </pic:nvPicPr>
                   <pic:blipFill>
@@ -9208,7 +9208,7 @@
           <wp:inline distT="0" distB="0" distL="0" distR="0">
             <wp:extent cx="5303520" cy="3082671"/>
             <wp:effectExtent l="0" t="0" r="0" b="0"/>
-            <wp:docPr id="49157" name="p2_coordatt_960_val_batch0_pred.jpg"/>
+            <wp:docPr id="51929" name="p2_coordatt_960_val_batch0_pred.jpg"/>
             <wp:cNvGraphicFramePr>
               <a:graphicFrameLocks noChangeAspect="1"/>
             </wp:cNvGraphicFramePr>
@@ -9216,7 +9216,7 @@
               <a:graphicData uri="http://schemas.openxmlformats.org/drawingml/2006/picture">
                 <pic:pic>
                   <pic:nvPicPr>
-                    <pic:cNvPr id="49158" name="p2_coordatt_960_val_batch0_pred.jpg"/>
+                    <pic:cNvPr id="51930" name="p2_coordatt_960_val_batch0_pred.jpg"/>
                     <pic:cNvPicPr/>
                   </pic:nvPicPr>
                   <pic:blipFill>
@@ -9279,7 +9279,7 @@
           <wp:inline distT="0" distB="0" distL="0" distR="0">
             <wp:extent cx="5303520" cy="12493526"/>
             <wp:effectExtent l="0" t="0" r="0" b="0"/>
-            <wp:docPr id="69730" name="p2_case_contact_sheet.jpg"/>
+            <wp:docPr id="62457" name="p2_case_contact_sheet.jpg"/>
             <wp:cNvGraphicFramePr>
               <a:graphicFrameLocks noChangeAspect="1"/>
             </wp:cNvGraphicFramePr>
@@ -9287,7 +9287,7 @@
               <a:graphicData uri="http://schemas.openxmlformats.org/drawingml/2006/picture">
                 <pic:pic>
                   <pic:nvPicPr>
-                    <pic:cNvPr id="69731" name="p2_case_contact_sheet.jpg"/>
+                    <pic:cNvPr id="62458" name="p2_case_contact_sheet.jpg"/>
                     <pic:cNvPicPr/>
                   </pic:nvPicPr>
                   <pic:blipFill>

</xml_diff>

<commit_message>
Fix CEA Word figure scaling
</commit_message>
<xml_diff>
--- a/paper/cea_template_migration/manuscript_cea_template_draft.docx
+++ b/paper/cea_template_migration/manuscript_cea_template_draft.docx
@@ -849,9 +849,9 @@
       <w:r>
         <w:drawing>
           <wp:inline distT="0" distB="0" distL="0" distR="0">
-            <wp:extent cx="5303520" cy="2724792"/>
+            <wp:extent cx="2880360" cy="1479844"/>
             <wp:effectExtent l="0" t="0" r="0" b="0"/>
-            <wp:docPr id="92731" name="hrpca_yolo11n_overview.png"/>
+            <wp:docPr id="36109" name="hrpca_yolo11n_overview.png"/>
             <wp:cNvGraphicFramePr>
               <a:graphicFrameLocks noChangeAspect="1"/>
             </wp:cNvGraphicFramePr>
@@ -859,7 +859,7 @@
               <a:graphicData uri="http://schemas.openxmlformats.org/drawingml/2006/picture">
                 <pic:pic>
                   <pic:nvPicPr>
-                    <pic:cNvPr id="92732" name="hrpca_yolo11n_overview.png"/>
+                    <pic:cNvPr id="36110" name="hrpca_yolo11n_overview.png"/>
                     <pic:cNvPicPr/>
                   </pic:nvPicPr>
                   <pic:blipFill>
@@ -871,7 +871,7 @@
                   <pic:spPr>
                     <a:xfrm>
                       <a:off x="0" y="0"/>
-                      <a:ext cx="5303520" cy="2724792"/>
+                      <a:ext cx="2880360" cy="1479844"/>
                     </a:xfrm>
                     <a:prstGeom prst="rect">
                       <a:avLst/>
@@ -4123,9 +4123,9 @@
       <w:r>
         <w:drawing>
           <wp:inline distT="0" distB="0" distL="0" distR="0">
-            <wp:extent cx="5303520" cy="2651760"/>
+            <wp:extent cx="2880360" cy="1440180"/>
             <wp:effectExtent l="0" t="0" r="0" b="0"/>
-            <wp:docPr id="100008" name="p2_coordatt_960_results.png"/>
+            <wp:docPr id="81146" name="p2_coordatt_960_results.png"/>
             <wp:cNvGraphicFramePr>
               <a:graphicFrameLocks noChangeAspect="1"/>
             </wp:cNvGraphicFramePr>
@@ -4133,7 +4133,7 @@
               <a:graphicData uri="http://schemas.openxmlformats.org/drawingml/2006/picture">
                 <pic:pic>
                   <pic:nvPicPr>
-                    <pic:cNvPr id="100009" name="p2_coordatt_960_results.png"/>
+                    <pic:cNvPr id="81147" name="p2_coordatt_960_results.png"/>
                     <pic:cNvPicPr/>
                   </pic:nvPicPr>
                   <pic:blipFill>
@@ -4145,7 +4145,7 @@
                   <pic:spPr>
                     <a:xfrm>
                       <a:off x="0" y="0"/>
-                      <a:ext cx="5303520" cy="2651760"/>
+                      <a:ext cx="2880360" cy="1440180"/>
                     </a:xfrm>
                     <a:prstGeom prst="rect">
                       <a:avLst/>
@@ -5280,9 +5280,9 @@
       <w:r>
         <w:drawing>
           <wp:inline distT="0" distB="0" distL="0" distR="0">
-            <wp:extent cx="5303520" cy="3079463"/>
+            <wp:extent cx="2880360" cy="1672467"/>
             <wp:effectExtent l="0" t="0" r="0" b="0"/>
-            <wp:docPr id="3007" name="object_scale_distribution.png"/>
+            <wp:docPr id="50366" name="object_scale_distribution.png"/>
             <wp:cNvGraphicFramePr>
               <a:graphicFrameLocks noChangeAspect="1"/>
             </wp:cNvGraphicFramePr>
@@ -5290,7 +5290,7 @@
               <a:graphicData uri="http://schemas.openxmlformats.org/drawingml/2006/picture">
                 <pic:pic>
                   <pic:nvPicPr>
-                    <pic:cNvPr id="3008" name="object_scale_distribution.png"/>
+                    <pic:cNvPr id="50367" name="object_scale_distribution.png"/>
                     <pic:cNvPicPr/>
                   </pic:nvPicPr>
                   <pic:blipFill>
@@ -5302,7 +5302,7 @@
                   <pic:spPr>
                     <a:xfrm>
                       <a:off x="0" y="0"/>
-                      <a:ext cx="5303520" cy="3079463"/>
+                      <a:ext cx="2880360" cy="1672467"/>
                     </a:xfrm>
                     <a:prstGeom prst="rect">
                       <a:avLst/>
@@ -6214,9 +6214,9 @@
       <w:r>
         <w:drawing>
           <wp:inline distT="0" distB="0" distL="0" distR="0">
-            <wp:extent cx="5303520" cy="3148964"/>
+            <wp:extent cx="2880360" cy="1710213"/>
             <wp:effectExtent l="0" t="0" r="0" b="0"/>
-            <wp:docPr id="93834" name="scale_group_recall.png"/>
+            <wp:docPr id="24355" name="scale_group_recall.png"/>
             <wp:cNvGraphicFramePr>
               <a:graphicFrameLocks noChangeAspect="1"/>
             </wp:cNvGraphicFramePr>
@@ -6224,7 +6224,7 @@
               <a:graphicData uri="http://schemas.openxmlformats.org/drawingml/2006/picture">
                 <pic:pic>
                   <pic:nvPicPr>
-                    <pic:cNvPr id="93835" name="scale_group_recall.png"/>
+                    <pic:cNvPr id="24356" name="scale_group_recall.png"/>
                     <pic:cNvPicPr/>
                   </pic:nvPicPr>
                   <pic:blipFill>
@@ -6236,7 +6236,7 @@
                   <pic:spPr>
                     <a:xfrm>
                       <a:off x="0" y="0"/>
-                      <a:ext cx="5303520" cy="3148964"/>
+                      <a:ext cx="2880360" cy="1710213"/>
                     </a:xfrm>
                     <a:prstGeom prst="rect">
                       <a:avLst/>
@@ -9206,9 +9206,9 @@
       <w:r>
         <w:drawing>
           <wp:inline distT="0" distB="0" distL="0" distR="0">
-            <wp:extent cx="5303520" cy="3082671"/>
+            <wp:extent cx="2880360" cy="1674209"/>
             <wp:effectExtent l="0" t="0" r="0" b="0"/>
-            <wp:docPr id="51929" name="p2_coordatt_960_val_batch0_pred.jpg"/>
+            <wp:docPr id="43496" name="p2_coordatt_960_val_batch0_pred.jpg"/>
             <wp:cNvGraphicFramePr>
               <a:graphicFrameLocks noChangeAspect="1"/>
             </wp:cNvGraphicFramePr>
@@ -9216,7 +9216,7 @@
               <a:graphicData uri="http://schemas.openxmlformats.org/drawingml/2006/picture">
                 <pic:pic>
                   <pic:nvPicPr>
-                    <pic:cNvPr id="51930" name="p2_coordatt_960_val_batch0_pred.jpg"/>
+                    <pic:cNvPr id="43497" name="p2_coordatt_960_val_batch0_pred.jpg"/>
                     <pic:cNvPicPr/>
                   </pic:nvPicPr>
                   <pic:blipFill>
@@ -9228,7 +9228,7 @@
                   <pic:spPr>
                     <a:xfrm>
                       <a:off x="0" y="0"/>
-                      <a:ext cx="5303520" cy="3082671"/>
+                      <a:ext cx="2880360" cy="1674209"/>
                     </a:xfrm>
                     <a:prstGeom prst="rect">
                       <a:avLst/>
@@ -9277,9 +9277,9 @@
       <w:r>
         <w:drawing>
           <wp:inline distT="0" distB="0" distL="0" distR="0">
-            <wp:extent cx="5303520" cy="12493526"/>
+            <wp:extent cx="2561883" cy="6035040"/>
             <wp:effectExtent l="0" t="0" r="0" b="0"/>
-            <wp:docPr id="62457" name="p2_case_contact_sheet.jpg"/>
+            <wp:docPr id="60422" name="p2_case_contact_sheet.jpg"/>
             <wp:cNvGraphicFramePr>
               <a:graphicFrameLocks noChangeAspect="1"/>
             </wp:cNvGraphicFramePr>
@@ -9287,7 +9287,7 @@
               <a:graphicData uri="http://schemas.openxmlformats.org/drawingml/2006/picture">
                 <pic:pic>
                   <pic:nvPicPr>
-                    <pic:cNvPr id="62458" name="p2_case_contact_sheet.jpg"/>
+                    <pic:cNvPr id="60423" name="p2_case_contact_sheet.jpg"/>
                     <pic:cNvPicPr/>
                   </pic:nvPicPr>
                   <pic:blipFill>
@@ -9299,7 +9299,7 @@
                   <pic:spPr>
                     <a:xfrm>
                       <a:off x="0" y="0"/>
-                      <a:ext cx="5303520" cy="12493526"/>
+                      <a:ext cx="2561883" cy="6035040"/>
                     </a:xfrm>
                     <a:prstGeom prst="rect">
                       <a:avLst/>

</xml_diff>

<commit_message>
Align CEA Word figure and table layout
</commit_message>
<xml_diff>
--- a/paper/cea_template_migration/manuscript_cea_template_draft.docx
+++ b/paper/cea_template_migration/manuscript_cea_template_draft.docx
@@ -549,10 +549,10 @@
         <w:tblBorders>
           <w:top w:val="single" w:sz="8" w:space="0" w:color="000000"/>
           <w:bottom w:val="single" w:sz="8" w:space="0" w:color="000000"/>
-          <w:left w:val="single" w:sz="2" w:space="0" w:color="BFBFBF"/>
-          <w:right w:val="single" w:sz="2" w:space="0" w:color="BFBFBF"/>
+          <w:left w:val="nil"/>
+          <w:right w:val="nil"/>
           <w:insideH w:val="single" w:sz="4" w:space="0" w:color="808080"/>
-          <w:insideV w:val="single" w:sz="2" w:space="0" w:color="BFBFBF"/>
+          <w:insideV w:val="nil"/>
         </w:tblBorders>
       </w:tblPr>
       <w:tblGrid>
@@ -1058,9 +1058,9 @@
       <w:r>
         <w:drawing>
           <wp:inline distT="0" distB="0" distL="0" distR="0">
-            <wp:extent cx="5806440" cy="2983178"/>
+            <wp:extent cx="4983480" cy="2560365"/>
             <wp:effectExtent l="0" t="0" r="0" b="0"/>
-            <wp:docPr id="26608" name="hrpca_yolo11n_overview.png"/>
+            <wp:docPr id="66070" name="hrpca_yolo11n_overview.png"/>
             <wp:cNvGraphicFramePr>
               <a:graphicFrameLocks noChangeAspect="1"/>
             </wp:cNvGraphicFramePr>
@@ -1068,7 +1068,7 @@
               <a:graphicData uri="http://schemas.openxmlformats.org/drawingml/2006/picture">
                 <pic:pic>
                   <pic:nvPicPr>
-                    <pic:cNvPr id="26609" name="hrpca_yolo11n_overview.png"/>
+                    <pic:cNvPr id="66071" name="hrpca_yolo11n_overview.png"/>
                     <pic:cNvPicPr/>
                   </pic:nvPicPr>
                   <pic:blipFill>
@@ -1080,7 +1080,7 @@
                   <pic:spPr>
                     <a:xfrm>
                       <a:off x="0" y="0"/>
-                      <a:ext cx="5806440" cy="2983178"/>
+                      <a:ext cx="4983480" cy="2560365"/>
                     </a:xfrm>
                     <a:prstGeom prst="rect">
                       <a:avLst/>
@@ -1162,7 +1162,7 @@
           <w:sz w:val="20"/>
           <w:szCs w:val="20"/>
         </w:rPr>
-        <w:t xml:space="preserve">原始 YOLO11n 主要依赖 P3/P4/P5 检测尺度。对于 VisDrone 中大量远距离行人、车辆和非机动车目标，目标在多次下采样后容易在深层特征图中丢失细节。为缓解该问题，本文在 YOLO11n 检测头中加入 P2 高分辨率检测分支，使模型能够利用更浅层、更高空间分辨率的特征进行预测。改进后模型采用 P2/P3/P4/P5 四尺度输出，从而提高小尺度目标在特征图中的可见性。具体实现配置见项目中的 。</w:t>
+        <w:t xml:space="preserve">原始 YOLO11n 主要依赖 P3/P4/P5 检测尺度。对于 VisDrone 中大量远距离行人、车辆和非机动车目标，目标在多次下采样后容易在深层特征图中丢失细节。为缓解该问题，本文在 YOLO11n 检测头中加入 P2 高分辨率检测分支，使模型能够利用更浅层、更高空间分辨率的特征进行预测。改进后模型采用 P2/P3/P4/P5 四尺度输出，从而提高小尺度目标在特征图中的可见性。具体实现配置见项目中的 yolo11n_p2.yaml。</w:t>
       </w:r>
     </w:p>
     <w:p>
@@ -1202,7 +1202,7 @@
           <w:sz w:val="20"/>
           <w:szCs w:val="20"/>
         </w:rPr>
-        <w:t xml:space="preserve">在 P2 模型基础上，本文进一步加入 CoordAttention 模块。CoordAttention 在建模通道关系的同时保留方向位置信息，有助于模型在复杂背景下补充位置敏感特征表达。对于无人机航拍图像中的小目标和密集目标，该模块可能增强目标区域与背景区域的区分能力。需要强调的是，结合后续消融结果，CoordAttention 带来的收益幅度有限，主要作为 P2 结构后的轻量级补充增强模块。具体实现配置见项目中的 。</w:t>
+        <w:t xml:space="preserve">在 P2 模型基础上，本文进一步加入 CoordAttention 模块。CoordAttention 在建模通道关系的同时保留方向位置信息，有助于模型在复杂背景下补充位置敏感特征表达。对于无人机航拍图像中的小目标和密集目标，该模块可能增强目标区域与背景区域的区分能力。需要强调的是，结合后续消融结果，CoordAttention 带来的收益幅度有限，主要作为 P2 结构后的轻量级补充增强模块。具体实现配置见项目中的 yolo11n_p2_coordatt.yaml。</w:t>
       </w:r>
     </w:p>
     <w:p>
@@ -1255,7 +1255,7 @@
           <w:sz w:val="20"/>
           <w:szCs w:val="20"/>
         </w:rPr>
-        <w:t xml:space="preserve">此外，本文设计了小目标友好数据增强消融实验，设置包括 、、 和 。其中，较早关闭 mosaic 用于减少训练后期合成图像分布影响，较小 scale 用于降低小目标被过度缩小的风险，关闭 erasing 用于避免破坏小目标可见区域。当前结果显示该增强策略未超过 YOLO11n-P2-CA，因此本文仅将其作为训练策略消融进行讨论。</w:t>
+        <w:t xml:space="preserve">此外，本文设计了小目标友好数据增强消融实验，设置包括 close_mosaic: 20、scale: 0.35、copy_paste: 0.1 和 erasing: 0.0。其中，较早关闭 mosaic 用于减少训练后期合成图像分布影响，较小 scale 用于降低小目标被过度缩小的风险，关闭 erasing 用于避免破坏小目标可见区域。当前结果显示该增强策略未超过 YOLO11n-P2-CA，因此本文仅将其作为训练策略消融进行讨论。</w:t>
       </w:r>
     </w:p>
     <w:p>
@@ -1295,7 +1295,7 @@
           <w:sz w:val="20"/>
           <w:szCs w:val="20"/>
         </w:rPr>
-        <w:t xml:space="preserve">本节说明数据集、训练配置、评价指标和速度测试协议。所有实验结果均从训练日志、验证输出或 汇总文件中整理得到；官方 test-dev 指标仅在获得平台返回结果后使用。</w:t>
+        <w:t xml:space="preserve">本节说明数据集、训练配置、评价指标和速度测试协议。所有实验结果均从训练日志、验证输出或 paper/tables/ 汇总文件中整理得到；官方 test-dev 指标仅在获得平台返回结果后使用。</w:t>
       </w:r>
     </w:p>
     <w:p>
@@ -1308,7 +1308,7 @@
           <w:sz w:val="20"/>
           <w:szCs w:val="20"/>
         </w:rPr>
-        <w:t xml:space="preserve">实验基于 Ultralytics YOLO 框架，在 VisDrone2019-DET 数据集上进行。数据配置文件为 ，训练集、验证集和 test-dev 图像均转换为 YOLO 格式组织。所有已完成主实验均训练 100 个 epoch，并使用各实验输出目录中的 统计最终指标与最佳指标。当前未获得 VisDrone 官方 test-dev/test-challenge 返回结果，因此本文仅报告验证集结果。</w:t>
+        <w:t xml:space="preserve">实验基于 Ultralytics YOLO 框架，在 VisDrone2019-DET 数据集上进行。数据配置文件为 configs/dataset/visdrone.yaml，训练集、验证集和 test-dev 图像均转换为 YOLO 格式组织。所有已完成主实验均训练 100 个 epoch，并使用各实验输出目录中的 results.csv 统计最终指标与最佳指标。当前未获得 VisDrone 官方 test-dev/test-challenge 返回结果，因此本文仅报告验证集结果。</w:t>
       </w:r>
     </w:p>
     <w:p>
@@ -1321,7 +1321,7 @@
           <w:sz w:val="20"/>
           <w:szCs w:val="20"/>
         </w:rPr>
-        <w:t xml:space="preserve">实验环境与训练配置如表 2 所示。表中版本信息由当前本地环境命令自动检测得到；训练轮数、输入尺寸、batch size、随机种子和优化器设置来自训练配置、 或训练日志。</w:t>
+        <w:t xml:space="preserve">实验环境与训练配置如表 2 所示。表中版本信息由当前本地环境命令自动检测得到；训练轮数、输入尺寸、batch size、随机种子和优化器设置来自训练配置、args.yaml 或训练日志。</w:t>
       </w:r>
     </w:p>
     <w:p>
@@ -1378,10 +1378,10 @@
         <w:tblBorders>
           <w:top w:val="single" w:sz="8" w:space="0" w:color="000000"/>
           <w:bottom w:val="single" w:sz="8" w:space="0" w:color="000000"/>
-          <w:left w:val="single" w:sz="2" w:space="0" w:color="BFBFBF"/>
-          <w:right w:val="single" w:sz="2" w:space="0" w:color="BFBFBF"/>
+          <w:left w:val="nil"/>
+          <w:right w:val="nil"/>
           <w:insideH w:val="single" w:sz="4" w:space="0" w:color="808080"/>
-          <w:insideV w:val="single" w:sz="2" w:space="0" w:color="BFBFBF"/>
+          <w:insideV w:val="nil"/>
         </w:tblBorders>
       </w:tblPr>
       <w:tblGrid>
@@ -2069,7 +2069,7 @@
                 <w:sz w:val="17"/>
                 <w:szCs w:val="17"/>
               </w:rPr>
-              <w:t xml:space="preserve">YOLO11n 使用 ；P2 系列基于 进行可匹配层初始化，新增层随机初始化</w:t>
+              <w:t xml:space="preserve">YOLO11n 使用 yolo11n.pt；P2 系列基于 yolo11n.pt 进行可匹配层初始化，新增层随机初始化</w:t>
             </w:r>
           </w:p>
         </w:tc>
@@ -2226,7 +2226,7 @@
                 <w:sz w:val="17"/>
                 <w:szCs w:val="17"/>
               </w:rPr>
-              <w:t xml:space="preserve">采用 Ultralytics 默认验证流程；现有日志记录 、、</w:t>
+              <w:t xml:space="preserve">采用 Ultralytics 默认验证流程；现有日志记录 conf=None、iou=0.7、agnostic_nms=False</w:t>
             </w:r>
           </w:p>
         </w:tc>
@@ -2278,7 +2278,7 @@
                 <w:sz w:val="17"/>
                 <w:szCs w:val="17"/>
               </w:rPr>
-              <w:t xml:space="preserve">GPU 单图 wall-clock 计时，10 次预热、100 张样本，并记录 Ultralytics preprocess/inference/postprocess 时间</w:t>
+              <w:t xml:space="preserve">GPU 单图 model.predict wall-clock 计时，10 次预热、100 张样本，并记录 Ultralytics preprocess/inference/postprocess 时间</w:t>
             </w:r>
           </w:p>
         </w:tc>
@@ -2395,10 +2395,10 @@
         <w:tblBorders>
           <w:top w:val="single" w:sz="8" w:space="0" w:color="000000"/>
           <w:bottom w:val="single" w:sz="8" w:space="0" w:color="000000"/>
-          <w:left w:val="single" w:sz="2" w:space="0" w:color="BFBFBF"/>
-          <w:right w:val="single" w:sz="2" w:space="0" w:color="BFBFBF"/>
+          <w:left w:val="nil"/>
+          <w:right w:val="nil"/>
           <w:insideH w:val="single" w:sz="4" w:space="0" w:color="808080"/>
-          <w:insideV w:val="single" w:sz="2" w:space="0" w:color="BFBFBF"/>
+          <w:insideV w:val="nil"/>
         </w:tblBorders>
       </w:tblPr>
       <w:tblGrid>
@@ -4215,10 +4215,10 @@
         <w:tblBorders>
           <w:top w:val="single" w:sz="8" w:space="0" w:color="000000"/>
           <w:bottom w:val="single" w:sz="8" w:space="0" w:color="000000"/>
-          <w:left w:val="single" w:sz="2" w:space="0" w:color="BFBFBF"/>
-          <w:right w:val="single" w:sz="2" w:space="0" w:color="BFBFBF"/>
+          <w:left w:val="nil"/>
+          <w:right w:val="nil"/>
           <w:insideH w:val="single" w:sz="4" w:space="0" w:color="808080"/>
-          <w:insideV w:val="single" w:sz="2" w:space="0" w:color="BFBFBF"/>
+          <w:insideV w:val="nil"/>
         </w:tblBorders>
       </w:tblPr>
       <w:tblGrid>
@@ -6107,9 +6107,9 @@
       <w:r>
         <w:drawing>
           <wp:inline distT="0" distB="0" distL="0" distR="0">
-            <wp:extent cx="5806440" cy="2903220"/>
+            <wp:extent cx="4983480" cy="2491740"/>
             <wp:effectExtent l="0" t="0" r="0" b="0"/>
-            <wp:docPr id="78288" name="p2_coordatt_960_results.png"/>
+            <wp:docPr id="7098" name="p2_coordatt_960_results.png"/>
             <wp:cNvGraphicFramePr>
               <a:graphicFrameLocks noChangeAspect="1"/>
             </wp:cNvGraphicFramePr>
@@ -6117,7 +6117,7 @@
               <a:graphicData uri="http://schemas.openxmlformats.org/drawingml/2006/picture">
                 <pic:pic>
                   <pic:nvPicPr>
-                    <pic:cNvPr id="78289" name="p2_coordatt_960_results.png"/>
+                    <pic:cNvPr id="7099" name="p2_coordatt_960_results.png"/>
                     <pic:cNvPicPr/>
                   </pic:nvPicPr>
                   <pic:blipFill>
@@ -6129,7 +6129,7 @@
                   <pic:spPr>
                     <a:xfrm>
                       <a:off x="0" y="0"/>
-                      <a:ext cx="5806440" cy="2903220"/>
+                      <a:ext cx="4983480" cy="2491740"/>
                     </a:xfrm>
                     <a:prstGeom prst="rect">
                       <a:avLst/>
@@ -6268,10 +6268,10 @@
         <w:tblBorders>
           <w:top w:val="single" w:sz="8" w:space="0" w:color="000000"/>
           <w:bottom w:val="single" w:sz="8" w:space="0" w:color="000000"/>
-          <w:left w:val="single" w:sz="2" w:space="0" w:color="BFBFBF"/>
-          <w:right w:val="single" w:sz="2" w:space="0" w:color="BFBFBF"/>
+          <w:left w:val="nil"/>
+          <w:right w:val="nil"/>
           <w:insideH w:val="single" w:sz="4" w:space="0" w:color="808080"/>
-          <w:insideV w:val="single" w:sz="2" w:space="0" w:color="BFBFBF"/>
+          <w:insideV w:val="nil"/>
         </w:tblBorders>
       </w:tblPr>
       <w:tblGrid>
@@ -7477,10 +7477,10 @@
         <w:tblBorders>
           <w:top w:val="single" w:sz="8" w:space="0" w:color="000000"/>
           <w:bottom w:val="single" w:sz="8" w:space="0" w:color="000000"/>
-          <w:left w:val="single" w:sz="2" w:space="0" w:color="BFBFBF"/>
-          <w:right w:val="single" w:sz="2" w:space="0" w:color="BFBFBF"/>
+          <w:left w:val="nil"/>
+          <w:right w:val="nil"/>
           <w:insideH w:val="single" w:sz="4" w:space="0" w:color="808080"/>
-          <w:insideV w:val="single" w:sz="2" w:space="0" w:color="BFBFBF"/>
+          <w:insideV w:val="nil"/>
         </w:tblBorders>
       </w:tblPr>
       <w:tblGrid>
@@ -7916,9 +7916,9 @@
       <w:r>
         <w:drawing>
           <wp:inline distT="0" distB="0" distL="0" distR="0">
-            <wp:extent cx="5806440" cy="3371481"/>
+            <wp:extent cx="2926080" cy="1699014"/>
             <wp:effectExtent l="0" t="0" r="0" b="0"/>
-            <wp:docPr id="61902" name="object_scale_distribution.png"/>
+            <wp:docPr id="57433" name="object_scale_distribution.png"/>
             <wp:cNvGraphicFramePr>
               <a:graphicFrameLocks noChangeAspect="1"/>
             </wp:cNvGraphicFramePr>
@@ -7926,7 +7926,7 @@
               <a:graphicData uri="http://schemas.openxmlformats.org/drawingml/2006/picture">
                 <pic:pic>
                   <pic:nvPicPr>
-                    <pic:cNvPr id="61903" name="object_scale_distribution.png"/>
+                    <pic:cNvPr id="57434" name="object_scale_distribution.png"/>
                     <pic:cNvPicPr/>
                   </pic:nvPicPr>
                   <pic:blipFill>
@@ -7938,7 +7938,7 @@
                   <pic:spPr>
                     <a:xfrm>
                       <a:off x="0" y="0"/>
-                      <a:ext cx="5806440" cy="3371481"/>
+                      <a:ext cx="2926080" cy="1699014"/>
                     </a:xfrm>
                     <a:prstGeom prst="rect">
                       <a:avLst/>
@@ -7960,8 +7960,8 @@
         <w:rPr>
           <w:rFonts w:ascii="Times New Roman" w:eastAsia="SimSun" w:hAnsi="Times New Roman"/>
           <w:b/>
-          <w:sz w:val="18"/>
-          <w:szCs w:val="18"/>
+          <w:sz w:val="17"/>
+          <w:szCs w:val="17"/>
         </w:rPr>
         <w:t xml:space="preserve">图3 VisDrone 训练集和验证集目标尺度分布</w:t>
       </w:r>
@@ -7974,8 +7974,8 @@
       <w:r>
         <w:rPr>
           <w:rFonts w:ascii="Times New Roman" w:eastAsia="SimSun" w:hAnsi="Times New Roman"/>
-          <w:sz w:val="18"/>
-          <w:szCs w:val="18"/>
+          <w:sz w:val="17"/>
+          <w:szCs w:val="17"/>
         </w:rPr>
         <w:t xml:space="preserve">Fig.3 Object-scale distribution of the VisDrone training and validation sets</w:t>
       </w:r>
@@ -7983,17 +7983,6 @@
     <w:p>
       <w:pPr>
         <w:spacing w:before="0" w:after="160" w:line="160" w:lineRule="exact"/>
-      </w:pPr>
-    </w:p>
-    <w:p>
-      <w:pPr>
-        <w:sectPr>
-          <w:type w:val="continuous"/>
-          <w:pgSz w:w="11906" w:h="16838"/>
-          <w:pgMar w:top="1440" w:right="900" w:bottom="900" w:left="900" w:header="720" w:footer="720" w:gutter="0"/>
-          <w:cols w:space="397"/>
-          <w:docGrid w:type="lines" w:linePitch="290"/>
-        </w:sectPr>
       </w:pPr>
     </w:p>
     <w:p>
@@ -8006,7 +7995,7 @@
           <w:sz w:val="20"/>
           <w:szCs w:val="20"/>
         </w:rPr>
-        <w:t xml:space="preserve">在此基础上，本文进一步使用验证集预测结果进行尺度分组匹配分析。该分析采用 和 IoU=0.5 的阈值设置，将预测框与同类别标注框进行一对一匹配，并按标注框尺度统计召回率和预测精度。需要说明的是，该结果用于分析不同尺度目标的匹配情况，并不等同于官方 AP 指标。结果如表 7 和图 4 所示。与 YOLO11n 相比，YOLO11n-P2-CA-960 在 small 目标上的召回率由 0.308 提升至 0.455，提升幅度为 14.74 个百分点；medium 目标召回率由 0.712 提升至 0.781；large 目标召回率变化较小。该结果表明，最终模型的主要收益集中在 small 和 medium 目标，符合本文面向无人机航拍小目标检测的设计目标。</w:t>
+        <w:t xml:space="preserve">在此基础上，本文进一步使用验证集预测结果进行尺度分组匹配分析。该分析采用 conf=0.25 和 IoU=0.5 的阈值设置，将预测框与同类别标注框进行一对一匹配，并按标注框尺度统计召回率和预测精度。需要说明的是，该结果用于分析不同尺度目标的匹配情况，并不等同于官方 AP 指标。结果如表 7 和图 4 所示。与 YOLO11n 相比，YOLO11n-P2-CA-960 在 small 目标上的召回率由 0.308 提升至 0.455，提升幅度为 14.74 个百分点；medium 目标召回率由 0.712 提升至 0.781；large 目标召回率变化较小。该结果表明，最终模型的主要收益集中在 small 和 medium 目标，符合本文面向无人机航拍小目标检测的设计目标。</w:t>
       </w:r>
     </w:p>
     <w:p>
@@ -8063,10 +8052,10 @@
         <w:tblBorders>
           <w:top w:val="single" w:sz="8" w:space="0" w:color="000000"/>
           <w:bottom w:val="single" w:sz="8" w:space="0" w:color="000000"/>
-          <w:left w:val="single" w:sz="2" w:space="0" w:color="BFBFBF"/>
-          <w:right w:val="single" w:sz="2" w:space="0" w:color="BFBFBF"/>
+          <w:left w:val="nil"/>
+          <w:right w:val="nil"/>
           <w:insideH w:val="single" w:sz="4" w:space="0" w:color="808080"/>
-          <w:insideV w:val="single" w:sz="2" w:space="0" w:color="BFBFBF"/>
+          <w:insideV w:val="nil"/>
         </w:tblBorders>
       </w:tblPr>
       <w:tblGrid>
@@ -9393,9 +9382,9 @@
       <w:r>
         <w:drawing>
           <wp:inline distT="0" distB="0" distL="0" distR="0">
-            <wp:extent cx="5806440" cy="3447573"/>
+            <wp:extent cx="2926080" cy="1737360"/>
             <wp:effectExtent l="0" t="0" r="0" b="0"/>
-            <wp:docPr id="32233" name="scale_group_recall.png"/>
+            <wp:docPr id="95092" name="scale_group_recall.png"/>
             <wp:cNvGraphicFramePr>
               <a:graphicFrameLocks noChangeAspect="1"/>
             </wp:cNvGraphicFramePr>
@@ -9403,7 +9392,7 @@
               <a:graphicData uri="http://schemas.openxmlformats.org/drawingml/2006/picture">
                 <pic:pic>
                   <pic:nvPicPr>
-                    <pic:cNvPr id="32234" name="scale_group_recall.png"/>
+                    <pic:cNvPr id="95093" name="scale_group_recall.png"/>
                     <pic:cNvPicPr/>
                   </pic:nvPicPr>
                   <pic:blipFill>
@@ -9415,7 +9404,7 @@
                   <pic:spPr>
                     <a:xfrm>
                       <a:off x="0" y="0"/>
-                      <a:ext cx="5806440" cy="3447573"/>
+                      <a:ext cx="2926080" cy="1737360"/>
                     </a:xfrm>
                     <a:prstGeom prst="rect">
                       <a:avLst/>
@@ -9437,8 +9426,8 @@
         <w:rPr>
           <w:rFonts w:ascii="Times New Roman" w:eastAsia="SimSun" w:hAnsi="Times New Roman"/>
           <w:b/>
-          <w:sz w:val="18"/>
-          <w:szCs w:val="18"/>
+          <w:sz w:val="17"/>
+          <w:szCs w:val="17"/>
         </w:rPr>
         <w:t xml:space="preserve">图4 YOLO11n 与 YOLO11n-P2-CA-960 在不同尺度目标上的召回率对比</w:t>
       </w:r>
@@ -9451,8 +9440,8 @@
       <w:r>
         <w:rPr>
           <w:rFonts w:ascii="Times New Roman" w:eastAsia="SimSun" w:hAnsi="Times New Roman"/>
-          <w:sz w:val="18"/>
-          <w:szCs w:val="18"/>
+          <w:sz w:val="17"/>
+          <w:szCs w:val="17"/>
         </w:rPr>
         <w:t xml:space="preserve">Fig.4 Recall comparison between YOLO11n and YOLO11n-P2-CA-960 for different object scales</w:t>
       </w:r>
@@ -9460,17 +9449,6 @@
     <w:p>
       <w:pPr>
         <w:spacing w:before="0" w:after="160" w:line="160" w:lineRule="exact"/>
-      </w:pPr>
-    </w:p>
-    <w:p>
-      <w:pPr>
-        <w:sectPr>
-          <w:type w:val="continuous"/>
-          <w:pgSz w:w="11906" w:h="16838"/>
-          <w:pgMar w:top="1440" w:right="900" w:bottom="900" w:left="900" w:header="720" w:footer="720" w:gutter="0"/>
-          <w:cols w:space="397"/>
-          <w:docGrid w:type="lines" w:linePitch="290"/>
-        </w:sectPr>
       </w:pPr>
     </w:p>
     <w:p>
@@ -9554,10 +9532,10 @@
         <w:tblBorders>
           <w:top w:val="single" w:sz="8" w:space="0" w:color="000000"/>
           <w:bottom w:val="single" w:sz="8" w:space="0" w:color="000000"/>
-          <w:left w:val="single" w:sz="2" w:space="0" w:color="BFBFBF"/>
-          <w:right w:val="single" w:sz="2" w:space="0" w:color="BFBFBF"/>
+          <w:left w:val="nil"/>
+          <w:right w:val="nil"/>
           <w:insideH w:val="single" w:sz="4" w:space="0" w:color="808080"/>
-          <w:insideV w:val="single" w:sz="2" w:space="0" w:color="BFBFBF"/>
+          <w:insideV w:val="nil"/>
         </w:tblBorders>
       </w:tblPr>
       <w:tblGrid>
@@ -11634,7 +11612,7 @@
           <w:sz w:val="20"/>
           <w:szCs w:val="20"/>
         </w:rPr>
-        <w:t xml:space="preserve">表 9 给出了不同模型的复杂度和推理速度。所有速度结果均由 在同一台本地 GPU 上重新测试得到，采用单图 wall-clock 计时，包含预处理、推理和后处理开销。原始 YOLO11n 的平均延迟为 14.27 ms，FPS 为 70.09；YOLO11n-960 的平均延迟为 16.37 ms，FPS 为 61.09。YOLO11n-P2-960 的平均延迟为 17.96 ms，FPS 为 55.68；YOLO11s-960 的平均延迟为 16.10 ms，FPS 为 62.13，但参数量约为 9.432M。结合表 4 可见，YOLO11n-P2-960 的优势不在于超过更大模型，而在于以较小参数量获得 nano 级模型中的较好精度-速度折中。</w:t>
+        <w:t xml:space="preserve">表 9 给出了不同模型的复杂度和推理速度。所有速度结果均由 tools/benchmark_speed.py 在同一台本地 GPU 上重新测试得到，采用单图 model.predict wall-clock 计时，包含预处理、推理和后处理开销。原始 YOLO11n 的平均延迟为 14.27 ms，FPS 为 70.09；YOLO11n-960 的平均延迟为 16.37 ms，FPS 为 61.09。YOLO11n-P2-960 的平均延迟为 17.96 ms，FPS 为 55.68；YOLO11s-960 的平均延迟为 16.10 ms，FPS 为 62.13，但参数量约为 9.432M。结合表 4 可见，YOLO11n-P2-960 的优势不在于超过更大模型，而在于以较小参数量获得 nano 级模型中的较好精度-速度折中。</w:t>
       </w:r>
     </w:p>
     <w:p>
@@ -11691,10 +11669,10 @@
         <w:tblBorders>
           <w:top w:val="single" w:sz="8" w:space="0" w:color="000000"/>
           <w:bottom w:val="single" w:sz="8" w:space="0" w:color="000000"/>
-          <w:left w:val="single" w:sz="2" w:space="0" w:color="BFBFBF"/>
-          <w:right w:val="single" w:sz="2" w:space="0" w:color="BFBFBF"/>
+          <w:left w:val="nil"/>
+          <w:right w:val="nil"/>
           <w:insideH w:val="single" w:sz="4" w:space="0" w:color="808080"/>
-          <w:insideV w:val="single" w:sz="2" w:space="0" w:color="BFBFBF"/>
+          <w:insideV w:val="nil"/>
         </w:tblBorders>
       </w:tblPr>
       <w:tblGrid>
@@ -14160,7 +14138,7 @@
           <wp:inline distT="0" distB="0" distL="0" distR="0">
             <wp:extent cx="5806440" cy="3374993"/>
             <wp:effectExtent l="0" t="0" r="0" b="0"/>
-            <wp:docPr id="65468" name="p2_coordatt_960_val_batch0_pred.jpg"/>
+            <wp:docPr id="58445" name="p2_coordatt_960_val_batch0_pred.jpg"/>
             <wp:cNvGraphicFramePr>
               <a:graphicFrameLocks noChangeAspect="1"/>
             </wp:cNvGraphicFramePr>
@@ -14168,7 +14146,7 @@
               <a:graphicData uri="http://schemas.openxmlformats.org/drawingml/2006/picture">
                 <pic:pic>
                   <pic:nvPicPr>
-                    <pic:cNvPr id="65469" name="p2_coordatt_960_val_batch0_pred.jpg"/>
+                    <pic:cNvPr id="58446" name="p2_coordatt_960_val_batch0_pred.jpg"/>
                     <pic:cNvPicPr/>
                   </pic:nvPicPr>
                   <pic:blipFill>
@@ -14252,7 +14230,7 @@
           <wp:inline distT="0" distB="0" distL="0" distR="0">
             <wp:extent cx="5806440" cy="4559419"/>
             <wp:effectExtent l="0" t="0" r="0" b="0"/>
-            <wp:docPr id="75801" name="p2_case_contact_sheet_word_part1.jpg"/>
+            <wp:docPr id="18888" name="p2_case_contact_sheet_word_part1.jpg"/>
             <wp:cNvGraphicFramePr>
               <a:graphicFrameLocks noChangeAspect="1"/>
             </wp:cNvGraphicFramePr>
@@ -14260,7 +14238,7 @@
               <a:graphicData uri="http://schemas.openxmlformats.org/drawingml/2006/picture">
                 <pic:pic>
                   <pic:nvPicPr>
-                    <pic:cNvPr id="75802" name="p2_case_contact_sheet_word_part1.jpg"/>
+                    <pic:cNvPr id="18889" name="p2_case_contact_sheet_word_part1.jpg"/>
                     <pic:cNvPicPr/>
                   </pic:nvPicPr>
                   <pic:blipFill>
@@ -14294,7 +14272,7 @@
           <wp:inline distT="0" distB="0" distL="0" distR="0">
             <wp:extent cx="5806440" cy="4559419"/>
             <wp:effectExtent l="0" t="0" r="0" b="0"/>
-            <wp:docPr id="72012" name="p2_case_contact_sheet_word_part2.jpg"/>
+            <wp:docPr id="26264" name="p2_case_contact_sheet_word_part2.jpg"/>
             <wp:cNvGraphicFramePr>
               <a:graphicFrameLocks noChangeAspect="1"/>
             </wp:cNvGraphicFramePr>
@@ -14302,7 +14280,7 @@
               <a:graphicData uri="http://schemas.openxmlformats.org/drawingml/2006/picture">
                 <pic:pic>
                   <pic:nvPicPr>
-                    <pic:cNvPr id="72013" name="p2_case_contact_sheet_word_part2.jpg"/>
+                    <pic:cNvPr id="26265" name="p2_case_contact_sheet_word_part2.jpg"/>
                     <pic:cNvPicPr/>
                   </pic:nvPicPr>
                   <pic:blipFill>
@@ -14336,7 +14314,7 @@
           <wp:inline distT="0" distB="0" distL="0" distR="0">
             <wp:extent cx="5806440" cy="4559419"/>
             <wp:effectExtent l="0" t="0" r="0" b="0"/>
-            <wp:docPr id="51634" name="p2_case_contact_sheet_word_part3.jpg"/>
+            <wp:docPr id="93734" name="p2_case_contact_sheet_word_part3.jpg"/>
             <wp:cNvGraphicFramePr>
               <a:graphicFrameLocks noChangeAspect="1"/>
             </wp:cNvGraphicFramePr>
@@ -14344,7 +14322,7 @@
               <a:graphicData uri="http://schemas.openxmlformats.org/drawingml/2006/picture">
                 <pic:pic>
                   <pic:nvPicPr>
-                    <pic:cNvPr id="51635" name="p2_case_contact_sheet_word_part3.jpg"/>
+                    <pic:cNvPr id="93735" name="p2_case_contact_sheet_word_part3.jpg"/>
                     <pic:cNvPicPr/>
                   </pic:nvPicPr>
                   <pic:blipFill>
@@ -14494,10 +14472,10 @@
         <w:tblBorders>
           <w:top w:val="single" w:sz="8" w:space="0" w:color="000000"/>
           <w:bottom w:val="single" w:sz="8" w:space="0" w:color="000000"/>
-          <w:left w:val="single" w:sz="2" w:space="0" w:color="BFBFBF"/>
-          <w:right w:val="single" w:sz="2" w:space="0" w:color="BFBFBF"/>
+          <w:left w:val="nil"/>
+          <w:right w:val="nil"/>
           <w:insideH w:val="single" w:sz="4" w:space="0" w:color="808080"/>
-          <w:insideV w:val="single" w:sz="2" w:space="0" w:color="BFBFBF"/>
+          <w:insideV w:val="nil"/>
         </w:tblBorders>
       </w:tblPr>
       <w:tblGrid>

</xml_diff>

<commit_message>
Replace method overview figure
</commit_message>
<xml_diff>
--- a/paper/cea_template_migration/manuscript_cea_template_draft.docx
+++ b/paper/cea_template_migration/manuscript_cea_template_draft.docx
@@ -1058,9 +1058,9 @@
       <w:r>
         <w:drawing>
           <wp:inline distT="0" distB="0" distL="0" distR="0">
-            <wp:extent cx="4983480" cy="2560365"/>
+            <wp:extent cx="4983480" cy="2295023"/>
             <wp:effectExtent l="0" t="0" r="0" b="0"/>
-            <wp:docPr id="66070" name="hrpca_yolo11n_overview.png"/>
+            <wp:docPr id="6480" name="hrpca_yolo11n_overview.png"/>
             <wp:cNvGraphicFramePr>
               <a:graphicFrameLocks noChangeAspect="1"/>
             </wp:cNvGraphicFramePr>
@@ -1068,7 +1068,7 @@
               <a:graphicData uri="http://schemas.openxmlformats.org/drawingml/2006/picture">
                 <pic:pic>
                   <pic:nvPicPr>
-                    <pic:cNvPr id="66071" name="hrpca_yolo11n_overview.png"/>
+                    <pic:cNvPr id="6481" name="hrpca_yolo11n_overview.png"/>
                     <pic:cNvPicPr/>
                   </pic:nvPicPr>
                   <pic:blipFill>
@@ -1080,7 +1080,7 @@
                   <pic:spPr>
                     <a:xfrm>
                       <a:off x="0" y="0"/>
-                      <a:ext cx="4983480" cy="2560365"/>
+                      <a:ext cx="4983480" cy="2295023"/>
                     </a:xfrm>
                     <a:prstGeom prst="rect">
                       <a:avLst/>
@@ -6109,7 +6109,7 @@
           <wp:inline distT="0" distB="0" distL="0" distR="0">
             <wp:extent cx="4983480" cy="2491740"/>
             <wp:effectExtent l="0" t="0" r="0" b="0"/>
-            <wp:docPr id="7098" name="p2_coordatt_960_results.png"/>
+            <wp:docPr id="93338" name="p2_coordatt_960_results.png"/>
             <wp:cNvGraphicFramePr>
               <a:graphicFrameLocks noChangeAspect="1"/>
             </wp:cNvGraphicFramePr>
@@ -6117,7 +6117,7 @@
               <a:graphicData uri="http://schemas.openxmlformats.org/drawingml/2006/picture">
                 <pic:pic>
                   <pic:nvPicPr>
-                    <pic:cNvPr id="7099" name="p2_coordatt_960_results.png"/>
+                    <pic:cNvPr id="93339" name="p2_coordatt_960_results.png"/>
                     <pic:cNvPicPr/>
                   </pic:nvPicPr>
                   <pic:blipFill>
@@ -7918,7 +7918,7 @@
           <wp:inline distT="0" distB="0" distL="0" distR="0">
             <wp:extent cx="2926080" cy="1699014"/>
             <wp:effectExtent l="0" t="0" r="0" b="0"/>
-            <wp:docPr id="57433" name="object_scale_distribution.png"/>
+            <wp:docPr id="43707" name="object_scale_distribution.png"/>
             <wp:cNvGraphicFramePr>
               <a:graphicFrameLocks noChangeAspect="1"/>
             </wp:cNvGraphicFramePr>
@@ -7926,7 +7926,7 @@
               <a:graphicData uri="http://schemas.openxmlformats.org/drawingml/2006/picture">
                 <pic:pic>
                   <pic:nvPicPr>
-                    <pic:cNvPr id="57434" name="object_scale_distribution.png"/>
+                    <pic:cNvPr id="43708" name="object_scale_distribution.png"/>
                     <pic:cNvPicPr/>
                   </pic:nvPicPr>
                   <pic:blipFill>
@@ -9384,7 +9384,7 @@
           <wp:inline distT="0" distB="0" distL="0" distR="0">
             <wp:extent cx="2926080" cy="1737360"/>
             <wp:effectExtent l="0" t="0" r="0" b="0"/>
-            <wp:docPr id="95092" name="scale_group_recall.png"/>
+            <wp:docPr id="97755" name="scale_group_recall.png"/>
             <wp:cNvGraphicFramePr>
               <a:graphicFrameLocks noChangeAspect="1"/>
             </wp:cNvGraphicFramePr>
@@ -9392,7 +9392,7 @@
               <a:graphicData uri="http://schemas.openxmlformats.org/drawingml/2006/picture">
                 <pic:pic>
                   <pic:nvPicPr>
-                    <pic:cNvPr id="95093" name="scale_group_recall.png"/>
+                    <pic:cNvPr id="97756" name="scale_group_recall.png"/>
                     <pic:cNvPicPr/>
                   </pic:nvPicPr>
                   <pic:blipFill>
@@ -14138,7 +14138,7 @@
           <wp:inline distT="0" distB="0" distL="0" distR="0">
             <wp:extent cx="5806440" cy="3374993"/>
             <wp:effectExtent l="0" t="0" r="0" b="0"/>
-            <wp:docPr id="58445" name="p2_coordatt_960_val_batch0_pred.jpg"/>
+            <wp:docPr id="29818" name="p2_coordatt_960_val_batch0_pred.jpg"/>
             <wp:cNvGraphicFramePr>
               <a:graphicFrameLocks noChangeAspect="1"/>
             </wp:cNvGraphicFramePr>
@@ -14146,7 +14146,7 @@
               <a:graphicData uri="http://schemas.openxmlformats.org/drawingml/2006/picture">
                 <pic:pic>
                   <pic:nvPicPr>
-                    <pic:cNvPr id="58446" name="p2_coordatt_960_val_batch0_pred.jpg"/>
+                    <pic:cNvPr id="29819" name="p2_coordatt_960_val_batch0_pred.jpg"/>
                     <pic:cNvPicPr/>
                   </pic:nvPicPr>
                   <pic:blipFill>
@@ -14230,7 +14230,7 @@
           <wp:inline distT="0" distB="0" distL="0" distR="0">
             <wp:extent cx="5806440" cy="4559419"/>
             <wp:effectExtent l="0" t="0" r="0" b="0"/>
-            <wp:docPr id="18888" name="p2_case_contact_sheet_word_part1.jpg"/>
+            <wp:docPr id="67524" name="p2_case_contact_sheet_word_part1.jpg"/>
             <wp:cNvGraphicFramePr>
               <a:graphicFrameLocks noChangeAspect="1"/>
             </wp:cNvGraphicFramePr>
@@ -14238,7 +14238,7 @@
               <a:graphicData uri="http://schemas.openxmlformats.org/drawingml/2006/picture">
                 <pic:pic>
                   <pic:nvPicPr>
-                    <pic:cNvPr id="18889" name="p2_case_contact_sheet_word_part1.jpg"/>
+                    <pic:cNvPr id="67525" name="p2_case_contact_sheet_word_part1.jpg"/>
                     <pic:cNvPicPr/>
                   </pic:nvPicPr>
                   <pic:blipFill>
@@ -14272,7 +14272,7 @@
           <wp:inline distT="0" distB="0" distL="0" distR="0">
             <wp:extent cx="5806440" cy="4559419"/>
             <wp:effectExtent l="0" t="0" r="0" b="0"/>
-            <wp:docPr id="26264" name="p2_case_contact_sheet_word_part2.jpg"/>
+            <wp:docPr id="30483" name="p2_case_contact_sheet_word_part2.jpg"/>
             <wp:cNvGraphicFramePr>
               <a:graphicFrameLocks noChangeAspect="1"/>
             </wp:cNvGraphicFramePr>
@@ -14280,7 +14280,7 @@
               <a:graphicData uri="http://schemas.openxmlformats.org/drawingml/2006/picture">
                 <pic:pic>
                   <pic:nvPicPr>
-                    <pic:cNvPr id="26265" name="p2_case_contact_sheet_word_part2.jpg"/>
+                    <pic:cNvPr id="30484" name="p2_case_contact_sheet_word_part2.jpg"/>
                     <pic:cNvPicPr/>
                   </pic:nvPicPr>
                   <pic:blipFill>
@@ -14314,7 +14314,7 @@
           <wp:inline distT="0" distB="0" distL="0" distR="0">
             <wp:extent cx="5806440" cy="4559419"/>
             <wp:effectExtent l="0" t="0" r="0" b="0"/>
-            <wp:docPr id="93734" name="p2_case_contact_sheet_word_part3.jpg"/>
+            <wp:docPr id="92771" name="p2_case_contact_sheet_word_part3.jpg"/>
             <wp:cNvGraphicFramePr>
               <a:graphicFrameLocks noChangeAspect="1"/>
             </wp:cNvGraphicFramePr>
@@ -14322,7 +14322,7 @@
               <a:graphicData uri="http://schemas.openxmlformats.org/drawingml/2006/picture">
                 <pic:pic>
                   <pic:nvPicPr>
-                    <pic:cNvPr id="93735" name="p2_case_contact_sheet_word_part3.jpg"/>
+                    <pic:cNvPr id="92772" name="p2_case_contact_sheet_word_part3.jpg"/>
                     <pic:cNvPicPr/>
                   </pic:nvPicPr>
                   <pic:blipFill>

</xml_diff>

<commit_message>
Refine CEA abstract and refresh submission drafts
</commit_message>
<xml_diff>
--- a/paper/cea_template_migration/manuscript_cea_template_draft.docx
+++ b/paper/cea_template_migration/manuscript_cea_template_draft.docx
@@ -69,7 +69,7 @@
           <w:sz w:val="19"/>
           <w:szCs w:val="19"/>
         </w:rPr>
-        <w:t xml:space="preserve">摘  要：无人机航拍图像通常具有俯视视角、目标尺度小、分布密集、遮挡频繁和背景复杂等特点，对实时检测模型的小目标感知和定位能力提出了较高要求。针对 VisDrone 场景下的小目标检测问题，本文以 YOLO11n 为基线，构建并评估了一种结合 P2 高分辨率检测分支、CoordAttention 注意力机制和 960 输入分辨率的轻量化改进模型。该方法通过 P2 分支增强浅层高分辨率特征利用，通过 CoordAttention 引入方向位置敏感信息，并通过较高输入分辨率提高小目标在输入图像和特征图中的有效像素占比。实验结果表明，960 输入分辨率是性能增益的主要来源，P2 分支在高分辨率下进一步提升定位质量；在 nano 级轻量模型中，YOLO11n-P2-960 达到最佳 mAP50 0.424 和 mAP50-95 0.256，高于 YOLO11n-960 的 0.421 / 0.251 以及 YOLO11n-P2-CA-960 的 0.420 / 0.252，并保持 55.68 FPS。更大容量的 YOLO11s-960 达到 0.489 / 0.298，说明模型容量仍是提升精度的重要因素。因此，本文结果更适合被解释为轻量模型中的高分辨率输入主导、P2 分支有效补充、注意力模块收益有限的精度-复杂度折中，而不是对更大模型的全面优势。</w:t>
+        <w:t xml:space="preserve">摘  要：针对 VisDrone 无人机航拍场景中小目标密集、遮挡频繁、类别外观相似导致轻量检测模型召回不足和定位不稳定的问题，构建一种面向小目标的 YOLO11n 改进方案。该方案在 YOLO11n 基础上引入 P2 高分辨率检测分支，以增强浅层空间细节利用；结合 CoordAttention 注意力模块补充方向位置敏感信息，并评估 960 输入分辨率及小目标友好增强策略的影响。实验基于 VisDrone2019-DET 验证集和真实训练日志，统计精度、参数量、计算量与单图推理速度，并设置 YOLOv8n、YOLOv5n 和 YOLO11s 作为参考基线。结果表明，960 输入分辨率是主要增益来源，P2 分支在高分辨率下进一步提升定位质量；nano 级模型中 YOLO11n-P2-960 获得 mAP50 0.424、mAP50-95 0.256，优于 YOLO11n-960 的 0.421 / 0.251 和 YOLO11n-P2-CA-960 的 0.420 / 0.252，并保持 55.68 FPS。更大容量的 YOLO11s-960 达到 0.489 / 0.298，说明当前改进更适合用于轻量模型中的精度、速度与复杂度折中，不能简单视为对大容量模型的全面超越。</w:t>
       </w:r>
     </w:p>
     <w:p>
@@ -151,7 +151,7 @@
           <w:sz w:val="19"/>
           <w:szCs w:val="19"/>
         </w:rPr>
-        <w:t xml:space="preserve">Abstract: UAV aerial images usually contain small-scale objects, dense distributions, frequent occlusion, and complex backgrounds, which require real-time detectors to preserve fine spatial details. For the VisDrone detection scenario, this study takes YOLO11n as the baseline and evaluates a lightweight improved model that combines a P2 high-resolution detection branch, CoordAttention, and a 960 input resolution. The P2 branch enhances shallow high-resolution features, CoordAttention introduces direction-aware positional information, and the higher input resolution increases the effective pixels of small objects. The validation results show that the 960 input resolution is the dominant source of performance gain, while the P2 branch further improves localization quality. Among nano-scale lightweight models, YOLO11n-P2-960 achieves the best mAP50 of 0.424 and mAP50-95 of 0.256, outperforming YOLO11n-960 and YOLO11n-P2-CA-960 while maintaining 55.68 FPS. The larger YOLO11s-960 obtains 0.489 mAP50 and 0.298 mAP50-95, indicating that model capacity remains an important factor for accuracy improvement. Therefore, the results should be interpreted as an accuracy-complexity trade-off dominated by high-resolution input, supplemented by the P2 branch, with limited gains from the attention module under the current setting.</w:t>
+        <w:t xml:space="preserve">Abstract: To address insufficient recall of lightweight detectors caused by dense small objects, frequent occlusion, and similar category appearances in VisDrone UAV aerial scenes, a small-object-oriented YOLO11n improvement is constructed. The scheme introduces a P2 high-resolution detection branch into YOLO11n to enhance shallow spatial details, combines a CoordAttention module to supplement direction-aware positional information, and evaluates the effects of a 960 input resolution and a small-object-friendly augmentation strategy. Based on the VisDrone2019-DET validation set and real training logs, accuracy, parameter count, computation, and single-image inference speed are reported, with YOLOv8n, YOLOv5n, and YOLO11s used as reference baselines. Results show that the 960 input resolution is the main source of gain, while the P2 branch further improves localization quality under high-resolution input. Among nano-scale models, YOLO11n-P2-960 obtains an mAP50 of 0.424 and an mAP50-95 of 0.256, outperforming YOLO11n-960 with 0.421 / 0.251 and YOLO11n-P2-CA-960 with 0.420 / 0.252, while maintaining 55.68 FPS. The larger-capacity YOLO11s-960 reaches 0.489 / 0.298, indicating that the current improvement is more suitable as an accuracy-speed-complexity trade-off for lightweight models rather than a full replacement for larger-capacity models.</w:t>
       </w:r>
     </w:p>
     <w:p>
@@ -1060,7 +1060,7 @@
           <wp:inline distT="0" distB="0" distL="0" distR="0">
             <wp:extent cx="4983480" cy="2295023"/>
             <wp:effectExtent l="0" t="0" r="0" b="0"/>
-            <wp:docPr id="6480" name="hrpca_yolo11n_overview.png"/>
+            <wp:docPr id="77686" name="hrpca_yolo11n_overview.png"/>
             <wp:cNvGraphicFramePr>
               <a:graphicFrameLocks noChangeAspect="1"/>
             </wp:cNvGraphicFramePr>
@@ -1068,7 +1068,7 @@
               <a:graphicData uri="http://schemas.openxmlformats.org/drawingml/2006/picture">
                 <pic:pic>
                   <pic:nvPicPr>
-                    <pic:cNvPr id="6481" name="hrpca_yolo11n_overview.png"/>
+                    <pic:cNvPr id="77687" name="hrpca_yolo11n_overview.png"/>
                     <pic:cNvPicPr/>
                   </pic:nvPicPr>
                   <pic:blipFill>
@@ -6109,7 +6109,7 @@
           <wp:inline distT="0" distB="0" distL="0" distR="0">
             <wp:extent cx="4983480" cy="2491740"/>
             <wp:effectExtent l="0" t="0" r="0" b="0"/>
-            <wp:docPr id="93338" name="p2_coordatt_960_results.png"/>
+            <wp:docPr id="92055" name="p2_coordatt_960_results.png"/>
             <wp:cNvGraphicFramePr>
               <a:graphicFrameLocks noChangeAspect="1"/>
             </wp:cNvGraphicFramePr>
@@ -6117,7 +6117,7 @@
               <a:graphicData uri="http://schemas.openxmlformats.org/drawingml/2006/picture">
                 <pic:pic>
                   <pic:nvPicPr>
-                    <pic:cNvPr id="93339" name="p2_coordatt_960_results.png"/>
+                    <pic:cNvPr id="92056" name="p2_coordatt_960_results.png"/>
                     <pic:cNvPicPr/>
                   </pic:nvPicPr>
                   <pic:blipFill>
@@ -7918,7 +7918,7 @@
           <wp:inline distT="0" distB="0" distL="0" distR="0">
             <wp:extent cx="2926080" cy="1699014"/>
             <wp:effectExtent l="0" t="0" r="0" b="0"/>
-            <wp:docPr id="43707" name="object_scale_distribution.png"/>
+            <wp:docPr id="78430" name="object_scale_distribution.png"/>
             <wp:cNvGraphicFramePr>
               <a:graphicFrameLocks noChangeAspect="1"/>
             </wp:cNvGraphicFramePr>
@@ -7926,7 +7926,7 @@
               <a:graphicData uri="http://schemas.openxmlformats.org/drawingml/2006/picture">
                 <pic:pic>
                   <pic:nvPicPr>
-                    <pic:cNvPr id="43708" name="object_scale_distribution.png"/>
+                    <pic:cNvPr id="78431" name="object_scale_distribution.png"/>
                     <pic:cNvPicPr/>
                   </pic:nvPicPr>
                   <pic:blipFill>
@@ -9384,7 +9384,7 @@
           <wp:inline distT="0" distB="0" distL="0" distR="0">
             <wp:extent cx="2926080" cy="1737360"/>
             <wp:effectExtent l="0" t="0" r="0" b="0"/>
-            <wp:docPr id="97755" name="scale_group_recall.png"/>
+            <wp:docPr id="19745" name="scale_group_recall.png"/>
             <wp:cNvGraphicFramePr>
               <a:graphicFrameLocks noChangeAspect="1"/>
             </wp:cNvGraphicFramePr>
@@ -9392,7 +9392,7 @@
               <a:graphicData uri="http://schemas.openxmlformats.org/drawingml/2006/picture">
                 <pic:pic>
                   <pic:nvPicPr>
-                    <pic:cNvPr id="97756" name="scale_group_recall.png"/>
+                    <pic:cNvPr id="19746" name="scale_group_recall.png"/>
                     <pic:cNvPicPr/>
                   </pic:nvPicPr>
                   <pic:blipFill>
@@ -14138,7 +14138,7 @@
           <wp:inline distT="0" distB="0" distL="0" distR="0">
             <wp:extent cx="5806440" cy="3374993"/>
             <wp:effectExtent l="0" t="0" r="0" b="0"/>
-            <wp:docPr id="29818" name="p2_coordatt_960_val_batch0_pred.jpg"/>
+            <wp:docPr id="85485" name="p2_coordatt_960_val_batch0_pred.jpg"/>
             <wp:cNvGraphicFramePr>
               <a:graphicFrameLocks noChangeAspect="1"/>
             </wp:cNvGraphicFramePr>
@@ -14146,7 +14146,7 @@
               <a:graphicData uri="http://schemas.openxmlformats.org/drawingml/2006/picture">
                 <pic:pic>
                   <pic:nvPicPr>
-                    <pic:cNvPr id="29819" name="p2_coordatt_960_val_batch0_pred.jpg"/>
+                    <pic:cNvPr id="85486" name="p2_coordatt_960_val_batch0_pred.jpg"/>
                     <pic:cNvPicPr/>
                   </pic:nvPicPr>
                   <pic:blipFill>
@@ -14230,7 +14230,7 @@
           <wp:inline distT="0" distB="0" distL="0" distR="0">
             <wp:extent cx="5806440" cy="4559419"/>
             <wp:effectExtent l="0" t="0" r="0" b="0"/>
-            <wp:docPr id="67524" name="p2_case_contact_sheet_word_part1.jpg"/>
+            <wp:docPr id="65973" name="p2_case_contact_sheet_word_part1.jpg"/>
             <wp:cNvGraphicFramePr>
               <a:graphicFrameLocks noChangeAspect="1"/>
             </wp:cNvGraphicFramePr>
@@ -14238,7 +14238,7 @@
               <a:graphicData uri="http://schemas.openxmlformats.org/drawingml/2006/picture">
                 <pic:pic>
                   <pic:nvPicPr>
-                    <pic:cNvPr id="67525" name="p2_case_contact_sheet_word_part1.jpg"/>
+                    <pic:cNvPr id="65974" name="p2_case_contact_sheet_word_part1.jpg"/>
                     <pic:cNvPicPr/>
                   </pic:nvPicPr>
                   <pic:blipFill>
@@ -14272,7 +14272,7 @@
           <wp:inline distT="0" distB="0" distL="0" distR="0">
             <wp:extent cx="5806440" cy="4559419"/>
             <wp:effectExtent l="0" t="0" r="0" b="0"/>
-            <wp:docPr id="30483" name="p2_case_contact_sheet_word_part2.jpg"/>
+            <wp:docPr id="58425" name="p2_case_contact_sheet_word_part2.jpg"/>
             <wp:cNvGraphicFramePr>
               <a:graphicFrameLocks noChangeAspect="1"/>
             </wp:cNvGraphicFramePr>
@@ -14280,7 +14280,7 @@
               <a:graphicData uri="http://schemas.openxmlformats.org/drawingml/2006/picture">
                 <pic:pic>
                   <pic:nvPicPr>
-                    <pic:cNvPr id="30484" name="p2_case_contact_sheet_word_part2.jpg"/>
+                    <pic:cNvPr id="58426" name="p2_case_contact_sheet_word_part2.jpg"/>
                     <pic:cNvPicPr/>
                   </pic:nvPicPr>
                   <pic:blipFill>
@@ -14314,7 +14314,7 @@
           <wp:inline distT="0" distB="0" distL="0" distR="0">
             <wp:extent cx="5806440" cy="4559419"/>
             <wp:effectExtent l="0" t="0" r="0" b="0"/>
-            <wp:docPr id="92771" name="p2_case_contact_sheet_word_part3.jpg"/>
+            <wp:docPr id="40881" name="p2_case_contact_sheet_word_part3.jpg"/>
             <wp:cNvGraphicFramePr>
               <a:graphicFrameLocks noChangeAspect="1"/>
             </wp:cNvGraphicFramePr>
@@ -14322,7 +14322,7 @@
               <a:graphicData uri="http://schemas.openxmlformats.org/drawingml/2006/picture">
                 <pic:pic>
                   <pic:nvPicPr>
-                    <pic:cNvPr id="92772" name="p2_case_contact_sheet_word_part3.jpg"/>
+                    <pic:cNvPr id="40882" name="p2_case_contact_sheet_word_part3.jpg"/>
                     <pic:cNvPicPr/>
                   </pic:nvPicPr>
                   <pic:blipFill>

</xml_diff>